<commit_message>
Add teacher-approved inline essay annotations with exact anchors and feedback bubbles
</commit_message>
<xml_diff>
--- a/docs/Moon-Campus-New-Chat-Brief.docx
+++ b/docs/Moon-Campus-New-Chat-Brief.docx
@@ -217,6 +217,46 @@
     <w:p>
       <w:r>
         <w:t>- Delivery commit: используйте commit последнего изменения этого файла, не исторический b5894fe (это предыдущая защита draft эссе).</w:t>
+      </w:r>
+    </w:p>
+    <w:p>
+      <w:r>
+        <w:t>### Inline essay annotations — 14 октября 2026</w:t>
+      </w:r>
+    </w:p>
+    <w:p>
+      <w:r>
+        <w:t>ТЗ пользователя реализуется поверх существующих submissions, AI review и PUT `/learning/revisions/attempts/{id}/review`. Миграция не нужна: `RevisionAttempt.report` хранит `essay_annotation_draft`, `essay_annotation_version`, `essay_feedback_publication`. Точная привязка: original, start/end (Unicode code points, не UTF-16), source hash; ID стабилен для attempt/текста/позиции/category/intent. Недостоверные цитаты, неоднозначные повторы без позиций и malformed annotations отбрасываются.</w:t>
+      </w:r>
+    </w:p>
+    <w:p>
+      <w:r>
+        <w:t>Ровно три категории **для эссе**: Grammar (включая spelling/punctuation), Vocabulary, Style. Отдельный intent Correction / Improvement / Praise. Praise без replacement. Комментарии AI pending; преподаватель одобряет/отклоняет, редактирует replacement/explanation, смотрит Preview approved student feedback с Overall Feedback. Save essay grade · publish approved feedback публикует только approved и явно отредактированный общий отзыв. Переходящий AI draft никогда не заменяет опубликованный snapshot. Защита от устаревшего набора — source hash/version, HTTP409; criteria/rating/usage остаются прежними. Review и AI review блокируют одну строку на время операции, чтобы новый AI не затёр одновременно сохранённую оценку.</w:t>
+      </w:r>
+    </w:p>
+    <w:p>
+      <w:r>
+        <w:t>UI: оригинал эссе не переписывается, подчёркнутые фрагменты — кнопки с клавиатурным фокусом. Tap/click открывает короткую панель: категория/intent, original, replacement, explanation. При пересечениях текст разбивается на непересекающиеся интервалы, открываются все относящиеся замечания. Цвет обозначает intent: correction оранжевый, improvement синий, praise зелёный. Рендер только textContent, никакого HTML от AI. Общий отзыв после эссе, целевой объём 40–65 слов, краткая сила/приоритет/следующий шаг, учитель может редактировать.</w:t>
+      </w:r>
+    </w:p>
+    <w:p>
+      <w:r>
+        <w:t>Legacy grades/teacher_feedback сохранены; прежние AI language_errors доступны учителю как pending при точной уникальной цитате, spelling/punctuation объединены в Grammar. Старые неподтверждённые AI-примеры больше не публикуются автоматически по одному факту наличия оценки. Для утверждения использовать новый редактор. Regrade сохраняет draft/publication. Это изменение эссе, оно не меняет критерии Speaking или его процесс.</w:t>
+      </w:r>
+    </w:p>
+    <w:p>
+      <w:r>
+        <w:t>Проверка вручную: Results → student → Essay → Check essay with AI (имеющийся приватный ключ). Отметить Approve / Reject, поправить explanation, открыть Preview, затем Save essay grade · publish approved feedback. По приватной ссылке студента обновить результат: видны только approved; текст неизменён. Повторный AI не меняет опубликованный feedback до следующего Save.</w:t>
+      </w:r>
+    </w:p>
+    <w:p>
+      <w:r>
+        <w:t>Production evidence 14 октября: пользователь прислал Application startup complete и GET attempts 200 после сборки ffmpeg/API и frontend. Это подтверждает запуск API и чтение attempts, не успешный реальный ASR или последний annotations update. Последние inline annotations требуют следующего deploy.</w:t>
+      </w:r>
+    </w:p>
+    <w:p>
+      <w:r>
+        <w:t>Inline annotations validation 14 октября: 81 backend tests passed; 17 dashboard/student browser tests passed; 3 new mobile/desktop/editor browser tests passed. Дополнительно 3 существующих audio/text-feedback browser tests прошли в первом прогоне. Реальный платный запрос AI для нового формата не выполнялся; провайдер подменён mock в тестах.</w:t>
       </w:r>
     </w:p>
     <w:sectPr>

</xml_diff>